<commit_message>
promo smart-edu + ebook na ostatniej stronie wzorów PDF/DOCX; fix window.gtag (martwe eventy purchase/begin_checkout)
</commit_message>
<xml_diff>
--- a/public/downloads/przykladowa-praca-magisterska-administracja.docx
+++ b/public/downloads/przykladowa-praca-magisterska-administracja.docx
@@ -1046,7 +1046,7 @@
       </w:r>
     </w:p>
     <w:bookmarkEnd w:id="35"/>
-    <w:bookmarkStart w:id="36" w:name="wykaz-innych-źródeł"/>
+    <w:bookmarkStart w:id="39" w:name="wykaz-innych-źródeł"/>
     <w:p>
       <w:pPr>
         <w:pStyle w:val="Heading1"/>
@@ -1091,7 +1091,140 @@
         <w:t xml:space="preserve">Dane o frekwencji w głosowaniach budżetu obywatelskiego 2022–2025, serwisy BIP miast A, B i C.</w:t>
       </w:r>
     </w:p>
-    <w:bookmarkEnd w:id="36"/>
+    <w:p>
+      <w:r>
+        <w:br w:type="page"/>
+      </w:r>
+    </w:p>
+    <w:p>
+      <w:pPr>
+        <w:pStyle w:val="Center"/>
+      </w:pPr>
+      <w:r>
+        <w:rPr>
+          <w:b/>
+          <w:bCs/>
+        </w:rPr>
+        <w:t xml:space="preserve">O tym wzorze</w:t>
+      </w:r>
+    </w:p>
+    <w:p>
+      <w:pPr>
+        <w:pStyle w:val="BodyText"/>
+      </w:pPr>
+      <w:r>
+        <w:t xml:space="preserve">Wzór przygotowała redakcja serwisu</w:t>
+      </w:r>
+      <w:r>
+        <w:t xml:space="preserve"> </w:t>
+      </w:r>
+      <w:r>
+        <w:rPr>
+          <w:b/>
+          <w:bCs/>
+        </w:rPr>
+        <w:t xml:space="preserve">praca-magisterska.pl</w:t>
+      </w:r>
+      <w:r>
+        <w:t xml:space="preserve">. Możesz swobodnie wykorzystać jego strukturę, tabele i przypisy we własnej pracy. Pamiętaj tylko, żeby treść dostosować do wymagań swojego promotora i uczelni.</w:t>
+      </w:r>
+    </w:p>
+    <w:p>
+      <w:pPr>
+        <w:pStyle w:val="Note"/>
+      </w:pPr>
+      <w:r>
+        <w:rPr>
+          <w:b/>
+          <w:bCs/>
+        </w:rPr>
+        <w:t xml:space="preserve">Smart-Edu.ai — pierwsza wersja pracy w kilka godzin, nie w kilka miesięcy</w:t>
+      </w:r>
+    </w:p>
+    <w:p>
+      <w:pPr>
+        <w:pStyle w:val="Note"/>
+      </w:pPr>
+      <w:r>
+        <w:t xml:space="preserve">Podajesz temat, kierunek studiów i wytyczne promotora, a sztuczna inteligencja generuje unikalny, gotowy do edycji tekst: z poprawną strukturą rozdziałów, przypisami i bibliografią. Rejestracja jest darmowa, płacisz wyłącznie za wygenerowany tekst.</w:t>
+      </w:r>
+    </w:p>
+    <w:p>
+      <w:pPr>
+        <w:pStyle w:val="Note"/>
+      </w:pPr>
+      <w:hyperlink r:id="rId36">
+        <w:r>
+          <w:rPr>
+            <w:rStyle w:val="Hyperlink"/>
+            <w:b/>
+            <w:bCs/>
+          </w:rPr>
+          <w:t xml:space="preserve">www.smart-edu.ai</w:t>
+        </w:r>
+      </w:hyperlink>
+    </w:p>
+    <w:p>
+      <w:pPr>
+        <w:pStyle w:val="BodyText"/>
+      </w:pPr>
+      <w:r>
+        <w:t xml:space="preserve">Wolisz napisać pracę w pełni samodzielnie? Pomoże Ci ebook</w:t>
+      </w:r>
+      <w:r>
+        <w:t xml:space="preserve"> </w:t>
+      </w:r>
+      <w:r>
+        <w:rPr>
+          <w:b/>
+          <w:bCs/>
+        </w:rPr>
+        <w:t xml:space="preserve">„Jak napisać pracę magisterską. Kompletny przewodnik od A do Z”</w:t>
+      </w:r>
+      <w:r>
+        <w:t xml:space="preserve"> </w:t>
+      </w:r>
+      <w:r>
+        <w:t xml:space="preserve">— 250 stron praktycznych wskazówek, szablonów i checklist, z rozdziałem o etycznym korzystaniu z AI:</w:t>
+      </w:r>
+      <w:r>
+        <w:t xml:space="preserve"> </w:t>
+      </w:r>
+      <w:hyperlink r:id="rId37">
+        <w:r>
+          <w:rPr>
+            <w:rStyle w:val="Hyperlink"/>
+          </w:rPr>
+          <w:t xml:space="preserve">www.praca-magisterska.pl/sklep/praca-magisterska-ebook/</w:t>
+        </w:r>
+      </w:hyperlink>
+    </w:p>
+    <w:p>
+      <w:pPr>
+        <w:pStyle w:val="Center"/>
+      </w:pPr>
+      <w:r>
+        <w:rPr>
+          <w:i/>
+          <w:iCs/>
+        </w:rPr>
+        <w:t xml:space="preserve">Darmowe poradniki, wzory i ponad 2500 tematów prac:</w:t>
+      </w:r>
+      <w:r>
+        <w:t xml:space="preserve"> </w:t>
+      </w:r>
+      <w:hyperlink r:id="rId38">
+        <w:r>
+          <w:rPr>
+            <w:rStyle w:val="Hyperlink"/>
+            <w:b/>
+            <w:bCs/>
+          </w:rPr>
+          <w:t xml:space="preserve">www.praca-magisterska.pl</w:t>
+        </w:r>
+      </w:hyperlink>
+    </w:p>
+    <w:bookmarkEnd w:id="39"/>
     <w:sectPr/>
   </w:body>
 </w:document>

</xml_diff>